<commit_message>
fichiers parquet + pkl
</commit_message>
<xml_diff>
--- a/prompt.docx
+++ b/prompt.docx
@@ -29,13 +29,35 @@
       </w:r>
       <w:proofErr w:type="gramEnd"/>
       <w:r>
-        <w:t xml:space="preserve"> d’une stratégie long</w:t>
-      </w:r>
+        <w:t xml:space="preserve"> d’une stratégie long </w:t>
+      </w:r>
+      <w:proofErr w:type="spellStart"/>
+      <w:proofErr w:type="gramStart"/>
+      <w:r>
+        <w:t>only</w:t>
+      </w:r>
+      <w:proofErr w:type="spellEnd"/>
+      <w:r>
+        <w:t xml:space="preserve">  </w:t>
+      </w:r>
+      <w:proofErr w:type="spellStart"/>
+      <w:r>
+        <w:t>momentum</w:t>
+      </w:r>
+      <w:proofErr w:type="spellEnd"/>
+      <w:proofErr w:type="gramEnd"/>
+      <w:r>
+        <w:t xml:space="preserve"> sur le MSCI WORLD. Dans ce cadre, je souhaite aujourd’hui évoluer vers le poste de Head de l’OPC. Pour valider cette prise de responsabilité, mon supérieur m’a confié un projet décisif : concevoir </w:t>
+      </w:r>
+      <w:proofErr w:type="gramStart"/>
+      <w:r>
+        <w:t>une stratégie long</w:t>
+      </w:r>
+      <w:proofErr w:type="gramEnd"/>
       <w:r>
         <w:t xml:space="preserve"> </w:t>
       </w:r>
       <w:proofErr w:type="spellStart"/>
-      <w:proofErr w:type="gramStart"/>
       <w:r>
         <w:t>only</w:t>
       </w:r>
@@ -43,38 +65,145 @@
       <w:r>
         <w:t xml:space="preserve"> </w:t>
       </w:r>
+      <w:proofErr w:type="spellStart"/>
+      <w:r>
+        <w:t>momentum</w:t>
+      </w:r>
+      <w:proofErr w:type="spellEnd"/>
       <w:r>
         <w:t xml:space="preserve"> </w:t>
       </w:r>
+      <w:r>
+        <w:t xml:space="preserve">robuste, institutionnelle et pleinement industrialisable. L’objectif n’est pas de réinventer l’industrie, mais de démontrer ma capacité à structurer une approche disciplinée, performante et scalable, alignée avec les standards d’un asset manager européen. </w:t>
+      </w:r>
+    </w:p>
+    <w:p>
+      <w:r>
+        <w:t xml:space="preserve">Le mandat consiste à développer en Python un portefeuille long </w:t>
+      </w:r>
+      <w:proofErr w:type="spellStart"/>
+      <w:r>
+        <w:t>only</w:t>
+      </w:r>
+      <w:proofErr w:type="spellEnd"/>
+      <w:r>
+        <w:t xml:space="preserve"> </w:t>
+      </w:r>
       <w:proofErr w:type="spellStart"/>
       <w:r>
         <w:t>momentum</w:t>
       </w:r>
       <w:proofErr w:type="spellEnd"/>
-      <w:proofErr w:type="gramEnd"/>
+      <w:r>
+        <w:t xml:space="preserve"> sur le MSCI WORLD, sur la période du 2007-04-20 au 2026-01-30, avec un </w:t>
+      </w:r>
+      <w:proofErr w:type="spellStart"/>
+      <w:r>
+        <w:t>backtesting</w:t>
+      </w:r>
+      <w:proofErr w:type="spellEnd"/>
+      <w:r>
+        <w:t xml:space="preserve"> rigoureux intégrant les entrées et sorties successives de l’indice à chaque date de </w:t>
+      </w:r>
+      <w:proofErr w:type="spellStart"/>
+      <w:r>
+        <w:t>rebalancement</w:t>
+      </w:r>
+      <w:proofErr w:type="spellEnd"/>
+      <w:r>
+        <w:t xml:space="preserve"> (dernier jour de bourse de chaque fin de mois). L’univers d’investissement devra donc être dynamique, reflétant fidèlement la composition historique de l’indice à chaque date. Les données nécessaires ont été préalablement extraites et stockées en format parquet : membres historiques du MSCI WORLD, rendements du benchmark à chaque date de </w:t>
+      </w:r>
+      <w:proofErr w:type="spellStart"/>
+      <w:r>
+        <w:t>rebalancement</w:t>
+      </w:r>
+      <w:proofErr w:type="spellEnd"/>
+      <w:r>
+        <w:t xml:space="preserve"> de l'indice (</w:t>
+      </w:r>
+      <w:proofErr w:type="spellStart"/>
+      <w:r>
+        <w:t>derier</w:t>
+      </w:r>
+      <w:proofErr w:type="spellEnd"/>
+      <w:r>
+        <w:t xml:space="preserve"> jours de chaque mois), compositions mensuelles de l’indice, ainsi que les métadonnées par </w:t>
+      </w:r>
+      <w:proofErr w:type="spellStart"/>
+      <w:r>
+        <w:t>ticker</w:t>
+      </w:r>
+      <w:proofErr w:type="spellEnd"/>
+      <w:r>
+        <w:t xml:space="preserve"> (nom, pays, devise, secteur, industrie). Le défi consiste à exploiter ces données pour construire une stratégie systématique disciplinée, intégrant sélection des signaux, construction de portefeuille, gestion du risque, contraintes opérationnelles et coûts de transaction, afin de produire un </w:t>
+      </w:r>
+      <w:proofErr w:type="spellStart"/>
+      <w:r>
+        <w:t>backtest</w:t>
+      </w:r>
+      <w:proofErr w:type="spellEnd"/>
+      <w:r>
+        <w:t xml:space="preserve"> institutionnellement défendable. Ce projet constitue la pierre angulaire de ma candidature au poste de Head de l’OPC.</w:t>
+      </w:r>
+    </w:p>
+    <w:p>
+      <w:r>
+        <w:t xml:space="preserve">2) Objectif : L’objectif est de concevoir en Python une stratégie long </w:t>
+      </w:r>
+      <w:proofErr w:type="spellStart"/>
+      <w:r>
+        <w:t>only</w:t>
+      </w:r>
+      <w:proofErr w:type="spellEnd"/>
+      <w:r>
+        <w:t xml:space="preserve"> robuste, industrialisable et institutionnellement défendable sur le MSCI WORLD, sur la période 2007-04-20 au 2026-01-30, en intégrant un univers dynamique, l’ensemble des contraintes réglementaires (UCITS 5/10/40), opérationnelles (frais de transaction, capital paramétrable) et méthodologiques. </w:t>
+      </w:r>
+    </w:p>
+    <w:p>
+      <w:r>
+        <w:t xml:space="preserve">La stratégie doit reposer sur un signal Momentum </w:t>
+      </w:r>
+      <w:r>
+        <w:t>de plusieurs type (basique, idiosyncratique, basique (</w:t>
+      </w:r>
+      <w:proofErr w:type="spellStart"/>
+      <w:r>
+        <w:t>mean</w:t>
+      </w:r>
+      <w:proofErr w:type="spellEnd"/>
       <w:r>
         <w:t xml:space="preserve"> </w:t>
       </w:r>
-      <w:r>
-        <w:t xml:space="preserve">sur le </w:t>
-      </w:r>
-      <w:r>
-        <w:t>MSCI WORLD</w:t>
-      </w:r>
-      <w:r>
-        <w:t xml:space="preserve">. Dans ce cadre, je souhaite aujourd’hui évoluer vers le poste de Head de l’OPC. Pour valider cette prise de responsabilité, mon supérieur m’a confié un projet décisif : concevoir </w:t>
-      </w:r>
-      <w:proofErr w:type="gramStart"/>
-      <w:r>
-        <w:t>une stratégie long</w:t>
-      </w:r>
-      <w:proofErr w:type="gramEnd"/>
+      <w:proofErr w:type="spellStart"/>
+      <w:r>
+        <w:t>reverting</w:t>
+      </w:r>
+      <w:proofErr w:type="spellEnd"/>
+      <w:r>
+        <w:t>), idiosyncratique (</w:t>
+      </w:r>
+      <w:proofErr w:type="spellStart"/>
+      <w:r>
+        <w:t>mean</w:t>
+      </w:r>
+      <w:proofErr w:type="spellEnd"/>
       <w:r>
         <w:t xml:space="preserve"> </w:t>
       </w:r>
       <w:proofErr w:type="spellStart"/>
       <w:r>
-        <w:t>only</w:t>
+        <w:t>reverting</w:t>
+      </w:r>
+      <w:proofErr w:type="spellEnd"/>
+      <w:r>
+        <w:t xml:space="preserve">) </w:t>
+      </w:r>
+      <w:r>
+        <w:t>et plusieurs méthodes d’allocation comparées (</w:t>
+      </w:r>
+      <w:proofErr w:type="spellStart"/>
+      <w:r>
+        <w:t>Equal</w:t>
       </w:r>
       <w:proofErr w:type="spellEnd"/>
       <w:r>
@@ -82,192 +211,11 @@
       </w:r>
       <w:proofErr w:type="spellStart"/>
       <w:r>
-        <w:t>momentum</w:t>
-      </w:r>
-      <w:proofErr w:type="spellEnd"/>
-      <w:r>
-        <w:t xml:space="preserve"> </w:t>
-      </w:r>
-      <w:r>
-        <w:t xml:space="preserve">robuste, institutionnelle et pleinement industrialisable. L’objectif n’est pas de réinventer l’industrie, mais de démontrer ma capacité à structurer une approche disciplinée, performante et scalable, alignée avec les standards d’un asset manager européen. </w:t>
-      </w:r>
-    </w:p>
-    <w:p>
-      <w:r>
-        <w:t xml:space="preserve">Le mandat consiste à développer en Python un portefeuille long </w:t>
-      </w:r>
-      <w:proofErr w:type="spellStart"/>
-      <w:r>
-        <w:t>only</w:t>
-      </w:r>
-      <w:proofErr w:type="spellEnd"/>
-      <w:r>
-        <w:t xml:space="preserve"> </w:t>
-      </w:r>
-      <w:proofErr w:type="spellStart"/>
-      <w:r>
-        <w:t>momentum</w:t>
-      </w:r>
-      <w:proofErr w:type="spellEnd"/>
-      <w:r>
-        <w:t xml:space="preserve"> sur le MSCI WORLD, sur la période du </w:t>
-      </w:r>
-      <w:r>
-        <w:t>2007-04-20</w:t>
-      </w:r>
-      <w:r>
-        <w:t xml:space="preserve"> au </w:t>
-      </w:r>
-      <w:r>
-        <w:t>2026-01-30</w:t>
-      </w:r>
-      <w:r>
-        <w:t xml:space="preserve">, avec un </w:t>
-      </w:r>
-      <w:proofErr w:type="spellStart"/>
-      <w:r>
-        <w:t>backtesting</w:t>
-      </w:r>
-      <w:proofErr w:type="spellEnd"/>
-      <w:r>
-        <w:t xml:space="preserve"> rigoureux intégrant les entrées et sorties successives de l’indice à chaque date de </w:t>
-      </w:r>
-      <w:proofErr w:type="spellStart"/>
-      <w:r>
-        <w:t>rebalancement</w:t>
-      </w:r>
-      <w:proofErr w:type="spellEnd"/>
-      <w:r>
-        <w:t xml:space="preserve"> (dernier jour de bourse de chaque fin de mois). L’univers d’investissement devra donc être dynamique, reflétant fidèlement la composition historique de l’indice à chaque date. Les données nécessaires ont été préalablement extraites et stockées en format parquet : membres historiques du </w:t>
-      </w:r>
-      <w:r>
-        <w:t>MSCI WORLD</w:t>
-      </w:r>
-      <w:r>
-        <w:t xml:space="preserve">, </w:t>
-      </w:r>
-      <w:r>
-        <w:t>rendements</w:t>
-      </w:r>
-      <w:r>
-        <w:t xml:space="preserve"> du benchmark</w:t>
-      </w:r>
-      <w:r>
-        <w:t xml:space="preserve"> à chaque date de </w:t>
-      </w:r>
-      <w:proofErr w:type="spellStart"/>
-      <w:r>
-        <w:t>rebalancement</w:t>
-      </w:r>
-      <w:proofErr w:type="spellEnd"/>
-      <w:r>
-        <w:t xml:space="preserve"> de l'indice (</w:t>
-      </w:r>
-      <w:proofErr w:type="spellStart"/>
-      <w:r>
-        <w:t>derier</w:t>
-      </w:r>
-      <w:proofErr w:type="spellEnd"/>
-      <w:r>
-        <w:t xml:space="preserve"> jours de chaque mois)</w:t>
-      </w:r>
-      <w:r>
-        <w:t xml:space="preserve">, compositions mensuelles de l’indice, ainsi que les métadonnées par </w:t>
-      </w:r>
-      <w:proofErr w:type="spellStart"/>
-      <w:r>
-        <w:t>ticker</w:t>
-      </w:r>
-      <w:proofErr w:type="spellEnd"/>
-      <w:r>
-        <w:t xml:space="preserve"> (nom, pays, devise, secteur, industrie). Le défi consiste à exploiter ces données pour construire une stratégie systématique disciplinée, intégrant sélection des signaux, construction de portefeuille, gestion du risque, contraintes opérationnelles et coûts de transaction, afin de produire un </w:t>
-      </w:r>
-      <w:proofErr w:type="spellStart"/>
-      <w:r>
-        <w:t>backtest</w:t>
-      </w:r>
-      <w:proofErr w:type="spellEnd"/>
-      <w:r>
-        <w:t xml:space="preserve"> institutionnellement défendable. Ce projet constitue la pierre angulaire de ma candidature au poste de Head de l’OPC.</w:t>
-      </w:r>
-    </w:p>
-    <w:p>
-      <w:r>
-        <w:t xml:space="preserve">2) </w:t>
-      </w:r>
-      <w:r>
-        <w:t>Objectif : L’objectif est de concevoir en Python une stratégie long</w:t>
-      </w:r>
-      <w:r>
-        <w:t xml:space="preserve"> </w:t>
-      </w:r>
-      <w:proofErr w:type="spellStart"/>
-      <w:r>
-        <w:t>only</w:t>
-      </w:r>
-      <w:proofErr w:type="spellEnd"/>
-      <w:r>
-        <w:t xml:space="preserve"> robuste, industrialisable et institutionnellement défendable sur le </w:t>
-      </w:r>
-      <w:r>
-        <w:t>MSCI WORLD</w:t>
-      </w:r>
-      <w:r>
-        <w:t>, sur la période 2007-04-20 au 2026-01-30, en intégrant un univers dynamique, l’ensemble des contraintes réglementaires (UCITS 5/10/40), opérationnelles (frais de transaction, capital paramétrable) et méthodologiques</w:t>
-      </w:r>
-      <w:r>
-        <w:t xml:space="preserve">. </w:t>
-      </w:r>
-    </w:p>
-    <w:p>
-      <w:r>
-        <w:t xml:space="preserve">La stratégie doit reposer sur un signal Momentum </w:t>
-      </w:r>
-      <w:r>
-        <w:t>de plusieurs type (basique, idiosyncratique, basique (</w:t>
-      </w:r>
-      <w:proofErr w:type="spellStart"/>
-      <w:r>
-        <w:t>mean</w:t>
-      </w:r>
-      <w:proofErr w:type="spellEnd"/>
-      <w:r>
-        <w:t xml:space="preserve"> </w:t>
-      </w:r>
-      <w:proofErr w:type="spellStart"/>
-      <w:r>
-        <w:t>reverting</w:t>
-      </w:r>
-      <w:proofErr w:type="spellEnd"/>
-      <w:r>
-        <w:t>), idiosyncratique (</w:t>
-      </w:r>
-      <w:proofErr w:type="spellStart"/>
-      <w:r>
-        <w:t>mean</w:t>
-      </w:r>
-      <w:proofErr w:type="spellEnd"/>
-      <w:r>
-        <w:t xml:space="preserve"> </w:t>
-      </w:r>
-      <w:proofErr w:type="spellStart"/>
-      <w:r>
-        <w:t>reverting</w:t>
-      </w:r>
-      <w:proofErr w:type="spellEnd"/>
-      <w:r>
-        <w:t xml:space="preserve">) </w:t>
-      </w:r>
-      <w:r>
-        <w:t>et plusieurs méthodes d’allocation comparées (</w:t>
-      </w:r>
-      <w:proofErr w:type="spellStart"/>
-      <w:r>
-        <w:t>Equal</w:t>
-      </w:r>
-      <w:proofErr w:type="spellEnd"/>
-      <w:r>
-        <w:t xml:space="preserve"> Weight, ERC, Min Var, pondération par signal). Le moteur de </w:t>
+        <w:t>Weight</w:t>
+      </w:r>
+      <w:proofErr w:type="spellEnd"/>
+      <w:r>
+        <w:t xml:space="preserve">, ERC, Min Var, pondération par signal). Le moteur de </w:t>
       </w:r>
       <w:proofErr w:type="spellStart"/>
       <w:r>
@@ -329,10 +277,7 @@
     <w:p/>
     <w:p>
       <w:r>
-        <w:t>3</w:t>
-      </w:r>
-      <w:r>
-        <w:t xml:space="preserve">) Data : </w:t>
+        <w:t xml:space="preserve">3) Data : </w:t>
       </w:r>
     </w:p>
     <w:p>
@@ -340,10 +285,7 @@
         <w:t xml:space="preserve">A. </w:t>
       </w:r>
       <w:r>
-        <w:t xml:space="preserve">Benchmark – </w:t>
-      </w:r>
-      <w:r>
-        <w:t>MSCI WORLD EUR</w:t>
+        <w:t>Benchmark – MSCI WORLD EUR</w:t>
       </w:r>
     </w:p>
     <w:p>
@@ -382,146 +324,353 @@
       </w:r>
       <w:proofErr w:type="spellEnd"/>
       <w:r>
-        <w:t>/Desktop/M2 272/coursS2/AssetManagement/Projet/AM_Arthur_Le_Net_M2272/data/storage/benchmark/historical_benchmark_returns_msci_world.parquet</w:t>
+        <w:t xml:space="preserve">/Desktop/M2 272/coursS2/AssetManagement/Projet/AM_Arthur_Le_Net_M2272/data/storage/benchmark/historical_benchmark_returns_msci_world.parquet </w:t>
+      </w:r>
+    </w:p>
+    <w:p>
+      <w:r>
+        <w:t xml:space="preserve">Ce fichier contient les rendements mensuels historiques du MSCI WORLD EUR </w:t>
+      </w:r>
+    </w:p>
+    <w:p>
+      <w:r>
+        <w:t>B</w:t>
+      </w:r>
+      <w:r>
+        <w:t xml:space="preserve">. </w:t>
+      </w:r>
+      <w:proofErr w:type="gramStart"/>
+      <w:r>
+        <w:t>le  taux</w:t>
+      </w:r>
+      <w:proofErr w:type="gramEnd"/>
+      <w:r>
+        <w:t xml:space="preserve"> sans risque pour le calcul des ratios ajustés du risque (Sharpe, alpha, etc.) est donné en mesure fixe = </w:t>
+      </w:r>
+      <w:r>
+        <w:t xml:space="preserve">1,03% par an </w:t>
+      </w:r>
+      <w:r>
+        <w:t>(c'est un taux moyen sur les 15 dernières années)</w:t>
+      </w:r>
+    </w:p>
+    <w:p>
+      <w:r>
+        <w:t xml:space="preserve">C. Informations descriptives des </w:t>
+      </w:r>
+      <w:proofErr w:type="spellStart"/>
+      <w:r>
+        <w:t>tickers</w:t>
+      </w:r>
+      <w:proofErr w:type="spellEnd"/>
+    </w:p>
+    <w:p>
+      <w:r>
+        <w:t>•</w:t>
+      </w:r>
+      <w:r>
+        <w:tab/>
+        <w:t>Variables disponibles :</w:t>
+      </w:r>
+    </w:p>
+    <w:p>
+      <w:proofErr w:type="gramStart"/>
+      <w:r>
+        <w:t>o</w:t>
+      </w:r>
+      <w:proofErr w:type="gramEnd"/>
+      <w:r>
+        <w:tab/>
+        <w:t>Name</w:t>
+      </w:r>
+    </w:p>
+    <w:p>
+      <w:proofErr w:type="gramStart"/>
+      <w:r>
+        <w:t>o</w:t>
+      </w:r>
+      <w:proofErr w:type="gramEnd"/>
+      <w:r>
+        <w:tab/>
+        <w:t>Country</w:t>
+      </w:r>
+    </w:p>
+    <w:p>
+      <w:proofErr w:type="gramStart"/>
+      <w:r>
+        <w:t>o</w:t>
+      </w:r>
+      <w:proofErr w:type="gramEnd"/>
+      <w:r>
+        <w:tab/>
+        <w:t>Currency</w:t>
+      </w:r>
+    </w:p>
+    <w:p>
+      <w:proofErr w:type="gramStart"/>
+      <w:r>
+        <w:t>o</w:t>
+      </w:r>
+      <w:proofErr w:type="gramEnd"/>
+      <w:r>
+        <w:tab/>
+      </w:r>
+      <w:proofErr w:type="spellStart"/>
+      <w:r>
+        <w:t>Sector</w:t>
+      </w:r>
+      <w:proofErr w:type="spellEnd"/>
+    </w:p>
+    <w:p>
+      <w:proofErr w:type="gramStart"/>
+      <w:r>
+        <w:t>o</w:t>
+      </w:r>
+      <w:proofErr w:type="gramEnd"/>
+      <w:r>
+        <w:tab/>
+      </w:r>
+      <w:proofErr w:type="spellStart"/>
+      <w:r>
+        <w:t>Industry</w:t>
+      </w:r>
+      <w:proofErr w:type="spellEnd"/>
+    </w:p>
+    <w:p>
+      <w:r>
+        <w:t>•</w:t>
+      </w:r>
+      <w:r>
+        <w:tab/>
+        <w:t xml:space="preserve">Fichier : </w:t>
+      </w:r>
+      <w:r>
+        <w:t>/</w:t>
+      </w:r>
+      <w:proofErr w:type="spellStart"/>
+      <w:r>
+        <w:t>Users</w:t>
+      </w:r>
+      <w:proofErr w:type="spellEnd"/>
+      <w:r>
+        <w:t>/</w:t>
+      </w:r>
+      <w:proofErr w:type="spellStart"/>
+      <w:r>
+        <w:t>arthurlenet</w:t>
+      </w:r>
+      <w:proofErr w:type="spellEnd"/>
+      <w:r>
+        <w:t>/Desktop/M2 272/coursS2/AssetManagement/Projet/AM_Arthur_Le_Net_M2272/data/informations_historical_components_msci_world.parquet</w:t>
+      </w:r>
+      <w:r>
+        <w:br/>
+      </w:r>
+      <w:r>
+        <w:br/>
+        <w:t>Ces informations devront être utilisées pour :</w:t>
+      </w:r>
+    </w:p>
+    <w:p>
+      <w:r>
+        <w:t>•</w:t>
+      </w:r>
+      <w:r>
+        <w:tab/>
+        <w:t>les analyses de composition (sectorielle, géographique, devise, industrie)</w:t>
+      </w:r>
+    </w:p>
+    <w:p>
+      <w:r>
+        <w:t>•</w:t>
+      </w:r>
+      <w:r>
+        <w:tab/>
+        <w:t>les contraintes éventuelles</w:t>
+      </w:r>
+    </w:p>
+    <w:p>
+      <w:r>
+        <w:t>•</w:t>
+      </w:r>
+      <w:r>
+        <w:tab/>
+        <w:t xml:space="preserve">les agrégations dans le </w:t>
+      </w:r>
+      <w:proofErr w:type="spellStart"/>
+      <w:r>
+        <w:t>reporting</w:t>
+      </w:r>
+      <w:proofErr w:type="spellEnd"/>
+    </w:p>
+    <w:p>
+      <w:r>
+        <w:t>D. Composition dynamique du MSCI WORLD</w:t>
+      </w:r>
+    </w:p>
+    <w:p>
+      <w:r>
+        <w:t>•</w:t>
+      </w:r>
+      <w:r>
+        <w:tab/>
+        <w:t xml:space="preserve">Composition du MSCI WORLD à chaque date de </w:t>
+      </w:r>
+      <w:proofErr w:type="spellStart"/>
+      <w:r>
+        <w:t>rebalancement</w:t>
+      </w:r>
+      <w:proofErr w:type="spellEnd"/>
+    </w:p>
+    <w:p>
+      <w:r>
+        <w:t>•</w:t>
+      </w:r>
+      <w:r>
+        <w:tab/>
+        <w:t xml:space="preserve">Date de </w:t>
+      </w:r>
+      <w:proofErr w:type="spellStart"/>
+      <w:r>
+        <w:t>rebalancement</w:t>
+      </w:r>
+      <w:proofErr w:type="spellEnd"/>
+      <w:r>
+        <w:t xml:space="preserve"> = dernier jour de bourse de chaque fin de mois</w:t>
+      </w:r>
+    </w:p>
+    <w:p>
+      <w:r>
+        <w:lastRenderedPageBreak/>
+        <w:t>•</w:t>
+      </w:r>
+      <w:r>
+        <w:tab/>
+        <w:t>Fichiers :</w:t>
       </w:r>
       <w:r>
         <w:t xml:space="preserve"> </w:t>
       </w:r>
-    </w:p>
-    <w:p>
-      <w:r>
-        <w:t xml:space="preserve">Ce fichier contient les </w:t>
-      </w:r>
-      <w:r>
-        <w:t>rendements mensuels historiques du MSCI WORLD EUR</w:t>
-      </w:r>
-      <w:r>
-        <w:t xml:space="preserve"> </w:t>
-      </w:r>
-    </w:p>
-    <w:p>
-      <w:r>
-        <w:t>B</w:t>
-      </w:r>
-      <w:r>
-        <w:t xml:space="preserve">. </w:t>
-      </w:r>
+      <w:r>
+        <w:t>/</w:t>
+      </w:r>
+      <w:proofErr w:type="spellStart"/>
+      <w:r>
+        <w:t>Users</w:t>
+      </w:r>
+      <w:proofErr w:type="spellEnd"/>
+      <w:r>
+        <w:t>/</w:t>
+      </w:r>
+      <w:proofErr w:type="spellStart"/>
+      <w:r>
+        <w:t>arthurlenet</w:t>
+      </w:r>
+      <w:proofErr w:type="spellEnd"/>
+      <w:r>
+        <w:t>/Desktop/M2 272/coursS2/AssetManagement/Projet/AM_Arthur_Le_Net_M2272/data/storage/monthly_components_msci_world/msci_world_components_</w:t>
+      </w:r>
+      <w:r>
+        <w:t>*</w:t>
+      </w:r>
+      <w:r>
+        <w:t>.parquet</w:t>
+      </w:r>
+      <w:r>
+        <w:br/>
+      </w:r>
+    </w:p>
+    <w:p>
       <w:proofErr w:type="gramStart"/>
       <w:r>
-        <w:t xml:space="preserve">le </w:t>
-      </w:r>
-      <w:r>
-        <w:t xml:space="preserve"> taux</w:t>
+        <w:t>où</w:t>
       </w:r>
       <w:proofErr w:type="gramEnd"/>
       <w:r>
-        <w:t xml:space="preserve"> sans risque pour le calcul des ratios ajustés du risque (Sharpe, alpha, etc.)</w:t>
-      </w:r>
-      <w:r>
-        <w:t xml:space="preserve"> est donné en mesure fixe = </w:t>
-      </w:r>
-      <w:r>
-        <w:t xml:space="preserve">1,03% par an </w:t>
-      </w:r>
-      <w:r>
-        <w:t>(c'est un taux moyen sur les 15 dernières années)</w:t>
-      </w:r>
-    </w:p>
-    <w:p>
-      <w:r>
-        <w:t>C.</w:t>
-      </w:r>
-      <w:r>
-        <w:t xml:space="preserve"> Informations descriptives des </w:t>
-      </w:r>
-      <w:proofErr w:type="spellStart"/>
-      <w:r>
-        <w:t>tickers</w:t>
-      </w:r>
-      <w:proofErr w:type="spellEnd"/>
-    </w:p>
-    <w:p>
-      <w:r>
-        <w:t>•</w:t>
-      </w:r>
-      <w:r>
-        <w:tab/>
-        <w:t>Variables disponibles :</w:t>
-      </w:r>
-    </w:p>
-    <w:p>
-      <w:proofErr w:type="gramStart"/>
-      <w:r>
-        <w:t>o</w:t>
-      </w:r>
-      <w:proofErr w:type="gramEnd"/>
-      <w:r>
-        <w:tab/>
-        <w:t>Name</w:t>
-      </w:r>
-    </w:p>
-    <w:p>
-      <w:proofErr w:type="gramStart"/>
-      <w:r>
-        <w:t>o</w:t>
-      </w:r>
-      <w:proofErr w:type="gramEnd"/>
-      <w:r>
-        <w:tab/>
-        <w:t>Country</w:t>
-      </w:r>
-    </w:p>
-    <w:p>
-      <w:proofErr w:type="gramStart"/>
-      <w:r>
-        <w:t>o</w:t>
-      </w:r>
-      <w:proofErr w:type="gramEnd"/>
-      <w:r>
-        <w:tab/>
-        <w:t>Currency</w:t>
-      </w:r>
-    </w:p>
-    <w:p>
-      <w:proofErr w:type="gramStart"/>
-      <w:r>
-        <w:t>o</w:t>
-      </w:r>
-      <w:proofErr w:type="gramEnd"/>
-      <w:r>
-        <w:tab/>
-      </w:r>
-      <w:proofErr w:type="spellStart"/>
-      <w:r>
-        <w:t>Sector</w:t>
-      </w:r>
-      <w:proofErr w:type="spellEnd"/>
-    </w:p>
-    <w:p>
-      <w:proofErr w:type="gramStart"/>
-      <w:r>
-        <w:t>o</w:t>
-      </w:r>
-      <w:proofErr w:type="gramEnd"/>
-      <w:r>
-        <w:tab/>
-      </w:r>
-      <w:proofErr w:type="spellStart"/>
-      <w:r>
-        <w:t>Industry</w:t>
-      </w:r>
-      <w:proofErr w:type="spellEnd"/>
-    </w:p>
-    <w:p>
-      <w:r>
-        <w:t>•</w:t>
-      </w:r>
-      <w:r>
-        <w:tab/>
-        <w:t>Fichier :</w:t>
-      </w:r>
-      <w:r>
-        <w:t xml:space="preserve"> </w:t>
+        <w:t xml:space="preserve"> * correspond à la date de </w:t>
+      </w:r>
+      <w:proofErr w:type="spellStart"/>
+      <w:r>
+        <w:t>rebalancement</w:t>
+      </w:r>
+      <w:proofErr w:type="spellEnd"/>
+      <w:r>
+        <w:t xml:space="preserve"> du portefeuille (dernier jour de bourse du mois).</w:t>
+      </w:r>
+    </w:p>
+    <w:p>
+      <w:r>
+        <w:t>Ces fichiers permettent de :</w:t>
+      </w:r>
+    </w:p>
+    <w:p>
+      <w:r>
+        <w:t>•</w:t>
+      </w:r>
+      <w:r>
+        <w:tab/>
+        <w:t>reconstruire l’univers dynamique à chaque date</w:t>
+      </w:r>
+    </w:p>
+    <w:p>
+      <w:r>
+        <w:t>•</w:t>
+      </w:r>
+      <w:r>
+        <w:tab/>
+        <w:t>prendre en compte les entrées et sorties de l’indice</w:t>
+      </w:r>
+    </w:p>
+    <w:p>
+      <w:r>
+        <w:t>•</w:t>
+      </w:r>
+      <w:r>
+        <w:tab/>
+        <w:t xml:space="preserve">éviter tout biais de </w:t>
+      </w:r>
+      <w:proofErr w:type="spellStart"/>
+      <w:r>
+        <w:t>survivorship</w:t>
+      </w:r>
+      <w:proofErr w:type="spellEnd"/>
+    </w:p>
+    <w:p>
+      <w:r>
+        <w:t>E.  Prix historiques des composants</w:t>
+      </w:r>
+    </w:p>
+    <w:p>
+      <w:r>
+        <w:t>•</w:t>
+      </w:r>
+      <w:r>
+        <w:tab/>
+      </w:r>
+      <w:proofErr w:type="spellStart"/>
+      <w:r>
+        <w:t>Historical</w:t>
+      </w:r>
+      <w:proofErr w:type="spellEnd"/>
+      <w:r>
+        <w:t xml:space="preserve"> close </w:t>
+      </w:r>
+      <w:proofErr w:type="spellStart"/>
+      <w:r>
+        <w:t>price</w:t>
+      </w:r>
+      <w:proofErr w:type="spellEnd"/>
+      <w:r>
+        <w:t xml:space="preserve"> de chaque composant historique de l’indice</w:t>
+      </w:r>
+    </w:p>
+    <w:p>
+      <w:r>
+        <w:t>•</w:t>
+      </w:r>
+      <w:r>
+        <w:tab/>
+        <w:t xml:space="preserve">Fichier : </w:t>
       </w:r>
       <w:r>
         <w:t>/</w:t>
@@ -540,254 +689,6 @@
       </w:r>
       <w:proofErr w:type="spellEnd"/>
       <w:r>
-        <w:t>/Desktop/M2 272/coursS2/AssetManagement/Projet/AM_Arthur_Le_Net_M2272/data/informations_historical_components_msci_world.parquet</w:t>
-      </w:r>
-      <w:r>
-        <w:br/>
-      </w:r>
-      <w:r>
-        <w:br/>
-      </w:r>
-      <w:r>
-        <w:t>Ces informations devront être utilisées pour :</w:t>
-      </w:r>
-    </w:p>
-    <w:p>
-      <w:r>
-        <w:t>•</w:t>
-      </w:r>
-      <w:r>
-        <w:tab/>
-        <w:t>les analyses de composition (sectorielle, géographique, devise, industrie)</w:t>
-      </w:r>
-    </w:p>
-    <w:p>
-      <w:r>
-        <w:t>•</w:t>
-      </w:r>
-      <w:r>
-        <w:tab/>
-        <w:t>les contraintes éventuelles</w:t>
-      </w:r>
-    </w:p>
-    <w:p>
-      <w:r>
-        <w:t>•</w:t>
-      </w:r>
-      <w:r>
-        <w:tab/>
-        <w:t xml:space="preserve">les agrégations dans le </w:t>
-      </w:r>
-      <w:proofErr w:type="spellStart"/>
-      <w:r>
-        <w:t>reporting</w:t>
-      </w:r>
-      <w:proofErr w:type="spellEnd"/>
-    </w:p>
-    <w:p>
-      <w:r>
-        <w:t xml:space="preserve">D. </w:t>
-      </w:r>
-      <w:r>
-        <w:t xml:space="preserve">Composition dynamique du </w:t>
-      </w:r>
-      <w:r>
-        <w:t>MSCI WORLD</w:t>
-      </w:r>
-    </w:p>
-    <w:p>
-      <w:r>
-        <w:t>•</w:t>
-      </w:r>
-      <w:r>
-        <w:tab/>
-        <w:t xml:space="preserve">Composition du </w:t>
-      </w:r>
-      <w:r>
-        <w:t>MSCI WORLD</w:t>
-      </w:r>
-      <w:r>
-        <w:t xml:space="preserve"> à chaque date de </w:t>
-      </w:r>
-      <w:proofErr w:type="spellStart"/>
-      <w:r>
-        <w:t>rebalancement</w:t>
-      </w:r>
-      <w:proofErr w:type="spellEnd"/>
-    </w:p>
-    <w:p>
-      <w:r>
-        <w:t>•</w:t>
-      </w:r>
-      <w:r>
-        <w:tab/>
-        <w:t xml:space="preserve">Date de </w:t>
-      </w:r>
-      <w:proofErr w:type="spellStart"/>
-      <w:r>
-        <w:t>rebalancement</w:t>
-      </w:r>
-      <w:proofErr w:type="spellEnd"/>
-      <w:r>
-        <w:t xml:space="preserve"> = dernier jour de bourse de chaque fin de mois</w:t>
-      </w:r>
-    </w:p>
-    <w:p>
-      <w:r>
-        <w:lastRenderedPageBreak/>
-        <w:t>•</w:t>
-      </w:r>
-      <w:r>
-        <w:tab/>
-        <w:t>Fichiers :</w:t>
-      </w:r>
-      <w:r>
-        <w:t xml:space="preserve"> </w:t>
-      </w:r>
-      <w:r>
-        <w:t>/</w:t>
-      </w:r>
-      <w:proofErr w:type="spellStart"/>
-      <w:r>
-        <w:t>Users</w:t>
-      </w:r>
-      <w:proofErr w:type="spellEnd"/>
-      <w:r>
-        <w:t>/</w:t>
-      </w:r>
-      <w:proofErr w:type="spellStart"/>
-      <w:r>
-        <w:t>arthurlenet</w:t>
-      </w:r>
-      <w:proofErr w:type="spellEnd"/>
-      <w:r>
-        <w:t>/Desktop/M2 272/coursS2/AssetManagement/Projet/AM_Arthur_Le_Net_M2272/data/storage/monthly_components_msci_world/msci_world_components_</w:t>
-      </w:r>
-      <w:r>
-        <w:t>*</w:t>
-      </w:r>
-      <w:r>
-        <w:t>.parquet</w:t>
-      </w:r>
-      <w:r>
-        <w:br/>
-      </w:r>
-    </w:p>
-    <w:p>
-      <w:proofErr w:type="gramStart"/>
-      <w:r>
-        <w:t>où</w:t>
-      </w:r>
-      <w:proofErr w:type="gramEnd"/>
-      <w:r>
-        <w:t xml:space="preserve"> * correspond à la date de </w:t>
-      </w:r>
-      <w:proofErr w:type="spellStart"/>
-      <w:r>
-        <w:t>rebalancement</w:t>
-      </w:r>
-      <w:proofErr w:type="spellEnd"/>
-      <w:r>
-        <w:t xml:space="preserve"> du portefeuille (dernier jour de bourse du mois).</w:t>
-      </w:r>
-    </w:p>
-    <w:p>
-      <w:r>
-        <w:t>Ces fichiers permettent de :</w:t>
-      </w:r>
-    </w:p>
-    <w:p>
-      <w:r>
-        <w:t>•</w:t>
-      </w:r>
-      <w:r>
-        <w:tab/>
-        <w:t>reconstruire l’univers dynamique à chaque date</w:t>
-      </w:r>
-    </w:p>
-    <w:p>
-      <w:r>
-        <w:t>•</w:t>
-      </w:r>
-      <w:r>
-        <w:tab/>
-        <w:t>prendre en compte les entrées et sorties de l’indice</w:t>
-      </w:r>
-    </w:p>
-    <w:p>
-      <w:r>
-        <w:t>•</w:t>
-      </w:r>
-      <w:r>
-        <w:tab/>
-        <w:t xml:space="preserve">éviter tout biais de </w:t>
-      </w:r>
-      <w:proofErr w:type="spellStart"/>
-      <w:r>
-        <w:t>survivorship</w:t>
-      </w:r>
-      <w:proofErr w:type="spellEnd"/>
-    </w:p>
-    <w:p>
-      <w:r>
-        <w:t xml:space="preserve">E. </w:t>
-      </w:r>
-      <w:r>
-        <w:t xml:space="preserve"> Prix historiques des composants</w:t>
-      </w:r>
-    </w:p>
-    <w:p>
-      <w:r>
-        <w:t>•</w:t>
-      </w:r>
-      <w:r>
-        <w:tab/>
-      </w:r>
-      <w:proofErr w:type="spellStart"/>
-      <w:r>
-        <w:t>Historical</w:t>
-      </w:r>
-      <w:proofErr w:type="spellEnd"/>
-      <w:r>
-        <w:t xml:space="preserve"> close </w:t>
-      </w:r>
-      <w:proofErr w:type="spellStart"/>
-      <w:r>
-        <w:t>price</w:t>
-      </w:r>
-      <w:proofErr w:type="spellEnd"/>
-      <w:r>
-        <w:t xml:space="preserve"> de chaque composant historique de l’indice</w:t>
-      </w:r>
-    </w:p>
-    <w:p>
-      <w:r>
-        <w:t>•</w:t>
-      </w:r>
-      <w:r>
-        <w:tab/>
-        <w:t>Fichier :</w:t>
-      </w:r>
-      <w:r>
-        <w:t xml:space="preserve"> </w:t>
-      </w:r>
-      <w:r>
-        <w:t>/</w:t>
-      </w:r>
-      <w:proofErr w:type="spellStart"/>
-      <w:r>
-        <w:t>Users</w:t>
-      </w:r>
-      <w:proofErr w:type="spellEnd"/>
-      <w:r>
-        <w:t>/</w:t>
-      </w:r>
-      <w:proofErr w:type="spellStart"/>
-      <w:r>
-        <w:t>arthurlenet</w:t>
-      </w:r>
-      <w:proofErr w:type="spellEnd"/>
-      <w:r>
         <w:t>/Desktop/M2 272/coursS2/AssetManagement/Projet/AM_Arthur_Le_Net_M2272/data/storage/historical_prices_eur_components_msci_world.parquet</w:t>
       </w:r>
     </w:p>
@@ -811,19 +712,7 @@
     </w:p>
     <w:p>
       <w:r>
-        <w:t xml:space="preserve">Cependant, le fichier contient des données de prix du </w:t>
-      </w:r>
-      <w:r>
-        <w:t>2000-01-03</w:t>
-      </w:r>
-      <w:r>
-        <w:t xml:space="preserve"> au </w:t>
-      </w:r>
-      <w:r>
-        <w:t>2026-01-30</w:t>
-      </w:r>
-      <w:r>
-        <w:t xml:space="preserve"> afin de disposer d’un historique suffisant pour :</w:t>
+        <w:t>Cependant, le fichier contient des données de prix du 2000-01-03 au 2026-01-30 afin de disposer d’un historique suffisant pour :</w:t>
       </w:r>
     </w:p>
     <w:p>
@@ -998,10 +887,7 @@
     </w:p>
     <w:p>
       <w:r>
-        <w:t>Je souhaite que tu mettes en œuvre les éléments suivants pour la construction du portefeuille long</w:t>
-      </w:r>
-      <w:r>
-        <w:t xml:space="preserve"> </w:t>
+        <w:t xml:space="preserve">Je souhaite que tu mettes en œuvre les éléments suivants pour la construction du portefeuille long </w:t>
       </w:r>
       <w:proofErr w:type="spellStart"/>
       <w:r>
@@ -1094,10 +980,7 @@
       </w:r>
       <w:proofErr w:type="gramEnd"/>
       <w:r>
-        <w:t xml:space="preserve"> 12 mois</w:t>
-      </w:r>
-      <w:r>
-        <w:t xml:space="preserve"> : </w:t>
+        <w:t xml:space="preserve"> 12 mois : </w:t>
       </w:r>
       <w:proofErr w:type="gramStart"/>
       <w:r>
@@ -1277,10 +1160,7 @@
         <w:spacing w:line="259" w:lineRule="auto"/>
       </w:pPr>
       <w:r>
-        <w:t xml:space="preserve">A) </w:t>
-      </w:r>
-      <w:r>
-        <w:t xml:space="preserve">segmentation sectorielle (best in class) ou pas (best in </w:t>
+        <w:t xml:space="preserve">A) segmentation sectorielle (best in class) ou pas (best in </w:t>
       </w:r>
       <w:proofErr w:type="spellStart"/>
       <w:r>
@@ -1301,10 +1181,7 @@
         <w:spacing w:line="259" w:lineRule="auto"/>
       </w:pPr>
       <w:r>
-        <w:t xml:space="preserve">B) </w:t>
-      </w:r>
-      <w:r>
-        <w:t xml:space="preserve">typologies de construction (décile / quintile / quartile) </w:t>
+        <w:t xml:space="preserve">B) typologies de construction (décile / quintile / quartile) </w:t>
       </w:r>
     </w:p>
     <w:p>
@@ -1314,10 +1191,7 @@
     </w:p>
     <w:p>
       <w:r>
-        <w:t xml:space="preserve">6) </w:t>
-      </w:r>
-      <w:r>
-        <w:t>Méthode de pondération de l’allocation</w:t>
+        <w:t>6) Méthode de pondération de l’allocation</w:t>
       </w:r>
     </w:p>
     <w:p>
@@ -1377,10 +1251,7 @@
         </w:numPr>
       </w:pPr>
       <w:r>
-        <w:t>(c) Markowitz (min var)</w:t>
-      </w:r>
-      <w:r>
-        <w:t xml:space="preserve"> </w:t>
+        <w:t xml:space="preserve">(c) Markowitz (min var) </w:t>
       </w:r>
     </w:p>
     <w:p>
@@ -1398,10 +1269,7 @@
     <w:p>
       <w:r>
         <w:lastRenderedPageBreak/>
-        <w:t>7</w:t>
-      </w:r>
-      <w:r>
-        <w:t xml:space="preserve">) Contraintes : </w:t>
+        <w:t xml:space="preserve">7) Contraintes : </w:t>
       </w:r>
     </w:p>
     <w:p>
@@ -1524,10 +1392,7 @@
     </w:p>
     <w:p>
       <w:r>
-        <w:t>8</w:t>
-      </w:r>
-      <w:r>
-        <w:t>) prise en compte obligatoire :</w:t>
+        <w:t>8) prise en compte obligatoire :</w:t>
       </w:r>
     </w:p>
     <w:p>
@@ -1756,11 +1621,9 @@
       <w:r>
         <w:t xml:space="preserve"> du benchmark est mensuel, </w:t>
       </w:r>
-      <w:proofErr w:type="spellStart"/>
-      <w:r>
-        <w:t>masi</w:t>
-      </w:r>
-      <w:proofErr w:type="spellEnd"/>
+      <w:r>
+        <w:t>mais</w:t>
+      </w:r>
       <w:r>
         <w:t xml:space="preserve"> nous souhaitons avoir plus de flexibilité : soit un </w:t>
       </w:r>

</xml_diff>